<commit_message>
fix: remove ink annotation circles from baitap1_muc14.docx
Co-Authored-By: Claude Sonnet 4.6 <noreply@anthropic.com>
</commit_message>
<xml_diff>
--- a/assets/docs/baitap1_muc14.docx
+++ b/assets/docs/baitap1_muc14.docx
@@ -34,163 +34,11 @@
         <w:rPr>
           <w:noProof/>
         </w:rPr>
-        <mc:AlternateContent>
-          <mc:Choice Requires="aink">
-            <w:drawing>
-              <wp:anchor distT="0" distB="0" distL="114300" distR="114300" simplePos="0" relativeHeight="251663360" behindDoc="0" locked="0" layoutInCell="1" allowOverlap="1" wp14:anchorId="415D954C" wp14:editId="7BAE5680">
-                <wp:simplePos x="0" y="0"/>
-                <wp:positionH relativeFrom="column">
-                  <wp:posOffset>1333500</wp:posOffset>
-                </wp:positionH>
-                <wp:positionV relativeFrom="paragraph">
-                  <wp:posOffset>1809750</wp:posOffset>
-                </wp:positionV>
-                <wp:extent cx="122160" cy="102235"/>
-                <wp:effectExtent l="57150" t="57150" r="49530" b="50165"/>
-                <wp:wrapNone/>
-                <wp:docPr id="2045034551" name="Ink 5"/>
-                <wp:cNvGraphicFramePr/>
-                <a:graphic xmlns:a="http://schemas.openxmlformats.org/drawingml/2006/main">
-                  <a:graphicData uri="http://schemas.microsoft.com/office/word/2010/wordprocessingInk">
-                    <w14:contentPart bwMode="auto" r:id="rId5">
-                      <w14:nvContentPartPr>
-                        <w14:cNvContentPartPr/>
-                      </w14:nvContentPartPr>
-                      <w14:xfrm>
-                        <a:off x="0" y="0"/>
-                        <a:ext cx="122160" cy="102235"/>
-                      </w14:xfrm>
-                    </w14:contentPart>
-                  </a:graphicData>
-                </a:graphic>
-              </wp:anchor>
-            </w:drawing>
-          </mc:Choice>
-          <mc:Fallback>
-            <w:drawing>
-              <wp:anchor distT="0" distB="0" distL="114300" distR="114300" simplePos="0" relativeHeight="251663360" behindDoc="0" locked="0" layoutInCell="1" allowOverlap="1" wp14:anchorId="415D954C" wp14:editId="7BAE5680">
-                <wp:simplePos x="0" y="0"/>
-                <wp:positionH relativeFrom="column">
-                  <wp:posOffset>1333500</wp:posOffset>
-                </wp:positionH>
-                <wp:positionV relativeFrom="paragraph">
-                  <wp:posOffset>1809750</wp:posOffset>
-                </wp:positionV>
-                <wp:extent cx="122160" cy="102235"/>
-                <wp:effectExtent l="57150" t="57150" r="49530" b="50165"/>
-                <wp:wrapNone/>
-                <wp:docPr id="2045034551" name="Ink 5"/>
-                <wp:cNvGraphicFramePr/>
-                <a:graphic xmlns:a="http://schemas.openxmlformats.org/drawingml/2006/main">
-                  <a:graphicData uri="http://schemas.openxmlformats.org/drawingml/2006/picture">
-                    <pic:pic xmlns:pic="http://schemas.openxmlformats.org/drawingml/2006/picture">
-                      <pic:nvPicPr>
-                        <pic:cNvPr id="2045034551" name="Ink 5"/>
-                        <pic:cNvPicPr/>
-                      </pic:nvPicPr>
-                      <pic:blipFill>
-                        <a:blip r:embed="rId6"/>
-                        <a:stretch>
-                          <a:fillRect/>
-                        </a:stretch>
-                      </pic:blipFill>
-                      <pic:spPr>
-                        <a:xfrm>
-                          <a:off x="0" y="0"/>
-                          <a:ext cx="139817" cy="119812"/>
-                        </a:xfrm>
-                        <a:prstGeom prst="rect">
-                          <a:avLst/>
-                        </a:prstGeom>
-                      </pic:spPr>
-                    </pic:pic>
-                  </a:graphicData>
-                </a:graphic>
-              </wp:anchor>
-            </w:drawing>
-          </mc:Fallback>
-        </mc:AlternateContent>
       </w:r>
       <w:r>
         <w:rPr>
           <w:noProof/>
         </w:rPr>
-        <mc:AlternateContent>
-          <mc:Choice Requires="aink">
-            <w:drawing>
-              <wp:anchor distT="0" distB="0" distL="114300" distR="114300" simplePos="0" relativeHeight="251659264" behindDoc="0" locked="0" layoutInCell="1" allowOverlap="1" wp14:anchorId="032F5976" wp14:editId="7B7FD7F3">
-                <wp:simplePos x="0" y="0"/>
-                <wp:positionH relativeFrom="column">
-                  <wp:posOffset>2300520</wp:posOffset>
-                </wp:positionH>
-                <wp:positionV relativeFrom="paragraph">
-                  <wp:posOffset>-16380</wp:posOffset>
-                </wp:positionV>
-                <wp:extent cx="595440" cy="535320"/>
-                <wp:effectExtent l="57150" t="57150" r="52705" b="55245"/>
-                <wp:wrapNone/>
-                <wp:docPr id="1467950465" name="Ink 1"/>
-                <wp:cNvGraphicFramePr/>
-                <a:graphic xmlns:a="http://schemas.openxmlformats.org/drawingml/2006/main">
-                  <a:graphicData uri="http://schemas.microsoft.com/office/word/2010/wordprocessingInk">
-                    <w14:contentPart bwMode="auto" r:id="rId7">
-                      <w14:nvContentPartPr>
-                        <w14:cNvContentPartPr/>
-                      </w14:nvContentPartPr>
-                      <w14:xfrm>
-                        <a:off x="0" y="0"/>
-                        <a:ext cx="595440" cy="535320"/>
-                      </w14:xfrm>
-                    </w14:contentPart>
-                  </a:graphicData>
-                </a:graphic>
-              </wp:anchor>
-            </w:drawing>
-          </mc:Choice>
-          <mc:Fallback>
-            <w:drawing>
-              <wp:anchor distT="0" distB="0" distL="114300" distR="114300" simplePos="0" relativeHeight="251659264" behindDoc="0" locked="0" layoutInCell="1" allowOverlap="1" wp14:anchorId="032F5976" wp14:editId="7B7FD7F3">
-                <wp:simplePos x="0" y="0"/>
-                <wp:positionH relativeFrom="column">
-                  <wp:posOffset>2300520</wp:posOffset>
-                </wp:positionH>
-                <wp:positionV relativeFrom="paragraph">
-                  <wp:posOffset>-16380</wp:posOffset>
-                </wp:positionV>
-                <wp:extent cx="595440" cy="535320"/>
-                <wp:effectExtent l="57150" t="57150" r="52705" b="55245"/>
-                <wp:wrapNone/>
-                <wp:docPr id="1467950465" name="Ink 1"/>
-                <wp:cNvGraphicFramePr/>
-                <a:graphic xmlns:a="http://schemas.openxmlformats.org/drawingml/2006/main">
-                  <a:graphicData uri="http://schemas.openxmlformats.org/drawingml/2006/picture">
-                    <pic:pic xmlns:pic="http://schemas.openxmlformats.org/drawingml/2006/picture">
-                      <pic:nvPicPr>
-                        <pic:cNvPr id="1467950465" name="Ink 1"/>
-                        <pic:cNvPicPr/>
-                      </pic:nvPicPr>
-                      <pic:blipFill>
-                        <a:blip r:embed="rId8"/>
-                        <a:stretch>
-                          <a:fillRect/>
-                        </a:stretch>
-                      </pic:blipFill>
-                      <pic:spPr>
-                        <a:xfrm>
-                          <a:off x="0" y="0"/>
-                          <a:ext cx="613080" cy="552960"/>
-                        </a:xfrm>
-                        <a:prstGeom prst="rect">
-                          <a:avLst/>
-                        </a:prstGeom>
-                      </pic:spPr>
-                    </pic:pic>
-                  </a:graphicData>
-                </a:graphic>
-              </wp:anchor>
-            </w:drawing>
-          </mc:Fallback>
-        </mc:AlternateContent>
       </w:r>
       <w:r>
         <w:drawing>
@@ -254,65 +102,6 @@
         <w:rPr>
           <w:noProof/>
         </w:rPr>
-        <mc:AlternateContent>
-          <mc:Choice Requires="wpi">
-            <w:drawing>
-              <wp:anchor distT="0" distB="0" distL="114300" distR="114300" simplePos="0" relativeHeight="251664384" behindDoc="0" locked="0" layoutInCell="1" allowOverlap="1" wp14:anchorId="0BEC584A" wp14:editId="1510B2E3">
-                <wp:simplePos x="0" y="0"/>
-                <wp:positionH relativeFrom="column">
-                  <wp:posOffset>-92760</wp:posOffset>
-                </wp:positionH>
-                <wp:positionV relativeFrom="paragraph">
-                  <wp:posOffset>89125</wp:posOffset>
-                </wp:positionV>
-                <wp:extent cx="437400" cy="324360"/>
-                <wp:effectExtent l="38100" t="38100" r="39370" b="38100"/>
-                <wp:wrapNone/>
-                <wp:docPr id="618141166" name="Ink 7"/>
-                <wp:cNvGraphicFramePr/>
-                <a:graphic xmlns:a="http://schemas.openxmlformats.org/drawingml/2006/main">
-                  <a:graphicData uri="http://schemas.microsoft.com/office/word/2010/wordprocessingInk">
-                    <w14:contentPart bwMode="auto" r:id="rId10">
-                      <w14:nvContentPartPr>
-                        <w14:cNvContentPartPr/>
-                      </w14:nvContentPartPr>
-                      <w14:xfrm>
-                        <a:off x="0" y="0"/>
-                        <a:ext cx="437400" cy="324360"/>
-                      </w14:xfrm>
-                    </w14:contentPart>
-                  </a:graphicData>
-                </a:graphic>
-              </wp:anchor>
-            </w:drawing>
-          </mc:Choice>
-          <mc:Fallback>
-            <w:pict>
-              <v:shapetype w14:anchorId="26765B31" id="_x0000_t75" coordsize="21600,21600" o:spt="75" o:preferrelative="t" path="m@4@5l@4@11@9@11@9@5xe" filled="f" stroked="f">
-                <v:stroke joinstyle="miter"/>
-                <v:formulas>
-                  <v:f eqn="if lineDrawn pixelLineWidth 0"/>
-                  <v:f eqn="sum @0 1 0"/>
-                  <v:f eqn="sum 0 0 @1"/>
-                  <v:f eqn="prod @2 1 2"/>
-                  <v:f eqn="prod @3 21600 pixelWidth"/>
-                  <v:f eqn="prod @3 21600 pixelHeight"/>
-                  <v:f eqn="sum @0 0 1"/>
-                  <v:f eqn="prod @6 1 2"/>
-                  <v:f eqn="prod @7 21600 pixelWidth"/>
-                  <v:f eqn="sum @8 21600 0"/>
-                  <v:f eqn="prod @7 21600 pixelHeight"/>
-                  <v:f eqn="sum @10 21600 0"/>
-                </v:formulas>
-                <v:path o:extrusionok="f" gradientshapeok="t" o:connecttype="rect"/>
-                <o:lock v:ext="edit" aspectratio="t"/>
-              </v:shapetype>
-              <v:shape id="Ink 7" o:spid="_x0000_s1026" type="#_x0000_t75" style="position:absolute;margin-left:-7.8pt;margin-top:6.5pt;width:35.45pt;height:26.55pt;z-index:251664384;visibility:visible;mso-wrap-style:square;mso-wrap-distance-left:9pt;mso-wrap-distance-top:0;mso-wrap-distance-right:9pt;mso-wrap-distance-bottom:0;mso-position-horizontal:absolute;mso-position-horizontal-relative:text;mso-position-vertical:absolute;mso-position-vertical-relative:text" o:gfxdata="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">
-                <v:imagedata r:id="rId11" o:title=""/>
-              </v:shape>
-            </w:pict>
-          </mc:Fallback>
-        </mc:AlternateContent>
       </w:r>
       <w:r>
         <w:drawing>

</xml_diff>